<commit_message>
LDM Attestation : detache le publipostage + supprime la page blanche
Le modele restait lie a la source de publipostage Excel : Word affichait
'L'ouverture execute la commande SQL SELECT * FROM Feuil1$' a chaque
ouverture. Retrait du bloc <w:mailMerge> de settings.xml et des deux
relations mailMergeSource -> plus aucun prompt.

Une page blanche s'intercalait entre la signature et les annexes : elle
venait de deux sauts de page vides encadrant le saut de section. Suppression
des deux paragraphes de saut de page (le saut de section, qui fait demarrer
les annexes sur une nouvelle page, est conserve). Verifie dans Word : 7
pages au lieu de 8, ouverture sans prompt.
</commit_message>
<xml_diff>
--- a/lib/templates/ldm-attestation.docx
+++ b/lib/templates/ldm-attestation.docx
@@ -1928,19 +1928,6 @@
         <w:rPr>
           <w:rFonts w:cstheme="majorHAnsi"/>
         </w:rPr>
-      </w:pPr>
-      <w:r>
-        <w:rPr>
-          <w:rFonts w:cstheme="majorHAnsi"/>
-        </w:rPr>
-        <w:br w:type="page"/>
-      </w:r>
-    </w:p>
-    <w:p>
-      <w:pPr>
-        <w:rPr>
-          <w:rFonts w:cstheme="majorHAnsi"/>
-        </w:rPr>
         <w:sectPr>
           <w:footerReference w:type="default" r:id="rId13"/>
           <w:headerReference w:type="first" r:id="rId14"/>
@@ -1953,25 +1940,6 @@
           <w:docGrid w:linePitch="326"/>
         </w:sectPr>
       </w:pPr>
-    </w:p>
-    <w:p>
-      <w:pPr>
-        <w:widowControl/>
-        <w:autoSpaceDE/>
-        <w:autoSpaceDN/>
-        <w:adjustRightInd/>
-        <w:jc w:val="left"/>
-        <w:rPr>
-          <w:rFonts w:cstheme="majorHAnsi"/>
-        </w:rPr>
-      </w:pPr>
-      <w:r>
-        <w:rPr>
-          <w:rFonts w:cstheme="majorHAnsi"/>
-        </w:rPr>
-        <w:lastRenderedPageBreak/>
-        <w:br w:type="page"/>
-      </w:r>
     </w:p>
     <w:bookmarkStart w:id="1" w:name="Annexe1"/>
     <w:p>

</xml_diff>